<commit_message>
Replace Artifact 2 with ML vs. Deep Learning case study
Swaps the Interview Prep Coach chatbot (AIML-500) for the
Machine Learning vs. Deep Learning case study essay (AIML-501,
Assignment 2.3), confirmed as the correct course for the 2.5
portfolio assignment. Also aligns Artifact 2's course badge with
Artifact 1's (AIML-501) and updates the combined overview doc.
</commit_message>
<xml_diff>
--- a/files/Portfolio Overview - Both Artifacts Explained.docx
+++ b/files/Portfolio Overview - Both Artifacts Explained.docx
@@ -136,7 +136,7 @@
           <w:sz w:val="32"/>
           <w:szCs w:val="32"/>
         </w:rPr>
-        <w:t xml:space="preserve">Artifact 2: Interview Prep Coach, A Design-Thinking Chatbot</w:t>
+        <w:t xml:space="preserve">Artifact 2: Machine Learning vs. Deep Learning, A Case Study Comparison</w:t>
       </w:r>
     </w:p>
     <w:p>
@@ -151,7 +151,7 @@
         <w:t xml:space="preserve">What it is: </w:t>
       </w:r>
       <w:r>
-        <w:t xml:space="preserve">A no-code AI chatbot, built with a team of eight in a single workshop, that helps candidates practice AI/ML and Data interviews. It generates five role-specific interview questions and evaluates a candidate's answers in four parts, all driven by a single carefully iterated system prompt on Chatbase.</w:t>
+        <w:t xml:space="preserve">A written analysis for AIML-501, Assignment 2.3, comparing machine learning and deep learning through two real-world cases: a support vector machine for customer churn prediction, and a convolutional neural network for facial recognition. Each case argues why that approach fits the problem and why the other one would fall short.</w:t>
       </w:r>
     </w:p>
     <w:p>
@@ -166,7 +166,7 @@
         <w:t xml:space="preserve">How it was made: </w:t>
       </w:r>
       <w:r>
-        <w:t xml:space="preserve">Our team applied the full design-thinking process: empathize, define, ideate, prototype, test. The empathize stage was the turning point. Our first instinct was to scrape the web and build a large question database, but talking through the real pain point showed the problem was never a shortage of questions. It was the lack of structure and honest feedback. That reframe saved an estimated two weeks of unnecessary engineering. We then ran 15 documented test scenarios against the bot, catching and fixing two real bugs (scripted, memorizable answers, and generic, role-agnostic follow-up questions) through two rounds of prompt iteration.</w:t>
+        <w:t xml:space="preserve">I drew on course readings covering machine learning and deep learning fundamentals, then picked two cases that sit on opposite ends of the same decision. Churn prediction uses small, structured data where the reasoning has to be explainable to a retention team, which favors a simple model. Facial recognition uses raw, high-dimensional pixel data where useful features cannot realistically be hand-built, which favors deep learning. For each case I argued both directions instead of just describing what the algorithm does.</w:t>
       </w:r>
     </w:p>
     <w:p>
@@ -181,7 +181,7 @@
         <w:t xml:space="preserve">Why it's here: </w:t>
       </w:r>
       <w:r>
-        <w:t xml:space="preserve">This shows I can work inside a team to take an AI product from a raw problem to a tested, working tool without writing traditional code, and that I can apply a human-centered design process with the same rigor I bring to financial systems. It's evidence of AI product judgment, not just AI usage.</w:t>
+        <w:t xml:space="preserve">This shows I don't default to the most complex or trendy model. I match model choice to the shape of the data and to whether the business actually needs the decision explained, the same judgment call that matters when evaluating whether an AI tool is worth adopting versus a simpler fix.</w:t>
       </w:r>
     </w:p>
     <w:p>
@@ -247,20 +247,7 @@
         <w:spacing w:after="90"/>
       </w:pPr>
       <w:r>
-        <w:t xml:space="preserve">Interview Prep Coach: full team presentation with live demo transcript and test log (.pptx)</w:t>
-      </w:r>
-    </w:p>
-    <w:p>
-      <w:pPr>
-        <w:pStyle w:val="ListParagraph"/>
-        <w:numPr>
-          <w:ilvl w:val="0"/>
-          <w:numId w:val="1"/>
-        </w:numPr>
-        <w:spacing w:after="90"/>
-      </w:pPr>
-      <w:r>
-        <w:t xml:space="preserve">Interview Prep Coach: individual artifact write-up (.docx)</w:t>
+        <w:t xml:space="preserve">Machine Learning vs. Deep Learning: A Case Study Comparison (full written analysis, .docx)</w:t>
       </w:r>
     </w:p>
     <w:sectPr>

</xml_diff>

<commit_message>
Add Artifact 3: Adapting to Challenges leadership reflection
Real AIML-501 coursework (Assignment 3.1), a leadership reflection
on decision-making under incomplete information and raising hard
truths strategically. Ties back to the growth areas identified in
Artifact 1. Updates the combined overview doc to cover all three
artifacts.
</commit_message>
<xml_diff>
--- a/files/Portfolio Overview - Both Artifacts Explained.docx
+++ b/files/Portfolio Overview - Both Artifacts Explained.docx
@@ -29,15 +29,15 @@
           <w:sz w:val="24"/>
           <w:szCs w:val="24"/>
         </w:rPr>
-        <w:t xml:space="preserve">What Artifact 1 and Artifact 2 Are, and Why They're Here</w:t>
-      </w:r>
-    </w:p>
-    <w:p>
-      <w:pPr>
-        <w:spacing w:after="180"/>
-      </w:pPr>
-      <w:r>
-        <w:t xml:space="preserve">This document explains both artifacts in my AIML portfolio side by side: what each one is, how it was made, and why it's included. Full write-ups, completed forms, and the team presentation are attached as separate files in the portfolio; this is the short version of both stories in one place.</w:t>
+        <w:t xml:space="preserve">What Artifacts 1, 2, and 3 Are, and Why They're Here</w:t>
+      </w:r>
+    </w:p>
+    <w:p>
+      <w:pPr>
+        <w:spacing w:after="180"/>
+      </w:pPr>
+      <w:r>
+        <w:t xml:space="preserve">This document explains all three artifacts in my AIML portfolio side by side: what each one is, how it was made, and why it's included. Full write-ups and completed forms are attached as separate files in the portfolio; this is the short version of all three stories in one place.</w:t>
       </w:r>
     </w:p>
     <w:p>
@@ -182,6 +182,78 @@
       </w:r>
       <w:r>
         <w:t xml:space="preserve">This shows I don't default to the most complex or trendy model. I match model choice to the shape of the data and to whether the business actually needs the decision explained, the same judgment call that matters when evaluating whether an AI tool is worth adopting versus a simpler fix.</w:t>
+      </w:r>
+    </w:p>
+    <w:p>
+      <w:pPr>
+        <w:pBdr>
+          <w:bottom w:val="single" w:color="D8DCE2" w:sz="6" w:space="4"/>
+        </w:pBdr>
+        <w:spacing w:after="200" w:before="200"/>
+      </w:pPr>
+      <w:r>
+        <w:t xml:space="preserve"/>
+      </w:r>
+    </w:p>
+    <w:p>
+      <w:pPr>
+        <w:pStyle w:val="Heading1"/>
+        <w:spacing w:after="100" w:before="480"/>
+      </w:pPr>
+      <w:r>
+        <w:rPr>
+          <w:b/>
+          <w:bCs/>
+          <w:color w:val="1A4D8F"/>
+          <w:sz w:val="32"/>
+          <w:szCs w:val="32"/>
+        </w:rPr>
+        <w:t xml:space="preserve">Artifact 3: Adapting to Challenges, Leading Through Uncertainty</w:t>
+      </w:r>
+    </w:p>
+    <w:p>
+      <w:pPr>
+        <w:spacing w:after="180"/>
+      </w:pPr>
+      <w:r>
+        <w:rPr>
+          <w:b/>
+          <w:bCs/>
+        </w:rPr>
+        <w:t xml:space="preserve">What it is: </w:t>
+      </w:r>
+      <w:r>
+        <w:t xml:space="preserve">A written reflection for AIML-501, Assignment 3.1, working through two leadership case studies (Moses and Esther) and applying each to a real challenge in my role: making decisions and communicating judgment calls when I do not yet have every answer.</w:t>
+      </w:r>
+    </w:p>
+    <w:p>
+      <w:pPr>
+        <w:spacing w:after="180"/>
+      </w:pPr>
+      <w:r>
+        <w:rPr>
+          <w:b/>
+          <w:bCs/>
+        </w:rPr>
+        <w:t xml:space="preserve">How it was made: </w:t>
+      </w:r>
+      <w:r>
+        <w:t xml:space="preserve">I worked through both assigned case studies against a real challenge I am facing now instead of answering in the abstract. For each, I named the instinct that shows up under pressure first (doubt in one case, silence in the other), then the specific practice I want to replace it with, grounded in something concrete from my actual work.</w:t>
+      </w:r>
+    </w:p>
+    <w:p>
+      <w:pPr>
+        <w:spacing w:after="180"/>
+      </w:pPr>
+      <w:r>
+        <w:rPr>
+          <w:b/>
+          <w:bCs/>
+        </w:rPr>
+        <w:t xml:space="preserve">Why it's here: </w:t>
+      </w:r>
+      <w:r>
+        <w:t xml:space="preserve">This is the judgment layer underneath the technical work in Artifacts 1 and 2. Artifact 1 named leading through difficult transitions and risk management as growth areas. This reflection is a concrete personal practice for closing that specific gap, not just an acknowledgment of it.</w:t>
       </w:r>
     </w:p>
     <w:p>
@@ -248,6 +320,19 @@
       </w:pPr>
       <w:r>
         <w:t xml:space="preserve">Machine Learning vs. Deep Learning: A Case Study Comparison (full written analysis, .docx)</w:t>
+      </w:r>
+    </w:p>
+    <w:p>
+      <w:pPr>
+        <w:pStyle w:val="ListParagraph"/>
+        <w:numPr>
+          <w:ilvl w:val="0"/>
+          <w:numId w:val="1"/>
+        </w:numPr>
+        <w:spacing w:after="90"/>
+      </w:pPr>
+      <w:r>
+        <w:t xml:space="preserve">Adapting to Challenges: Leading Through Uncertainty (full written reflection, .docx)</w:t>
       </w:r>
     </w:p>
     <w:sectPr>

</xml_diff>

<commit_message>
Add Artifact 4: AI/ML Tool Evaluation Scorecard
A self-directed, interactive weighted scorecard for AI/ML tool
adoption decisions, built to fill the tool-and-vendor evaluation
gap flagged in the Artifact 1 self-assessment reflection. Updates
the combined overview doc to cover all four artifacts.
</commit_message>
<xml_diff>
--- a/files/Portfolio Overview - Both Artifacts Explained.docx
+++ b/files/Portfolio Overview - Both Artifacts Explained.docx
@@ -29,15 +29,15 @@
           <w:sz w:val="24"/>
           <w:szCs w:val="24"/>
         </w:rPr>
-        <w:t xml:space="preserve">What Artifacts 1, 2, and 3 Are, and Why They're Here</w:t>
-      </w:r>
-    </w:p>
-    <w:p>
-      <w:pPr>
-        <w:spacing w:after="180"/>
-      </w:pPr>
-      <w:r>
-        <w:t xml:space="preserve">This document explains all three artifacts in my AIML portfolio side by side: what each one is, how it was made, and why it's included. Full write-ups and completed forms are attached as separate files in the portfolio; this is the short version of all three stories in one place.</w:t>
+        <w:t xml:space="preserve">What Artifacts 1 Through 4 Are, and Why They're Here</w:t>
+      </w:r>
+    </w:p>
+    <w:p>
+      <w:pPr>
+        <w:spacing w:after="180"/>
+      </w:pPr>
+      <w:r>
+        <w:t xml:space="preserve">This document explains all four artifacts in my AIML portfolio side by side: what each one is, how it was made, and why it's included. Full write-ups, completed forms, and the live tools are attached or linked as separate items in the portfolio; this is the short version of all four stories in one place.</w:t>
       </w:r>
     </w:p>
     <w:p>
@@ -254,6 +254,78 @@
       </w:r>
       <w:r>
         <w:t xml:space="preserve">This is the judgment layer underneath the technical work in Artifacts 1 and 2. Artifact 1 named leading through difficult transitions and risk management as growth areas. This reflection is a concrete personal practice for closing that specific gap, not just an acknowledgment of it.</w:t>
+      </w:r>
+    </w:p>
+    <w:p>
+      <w:pPr>
+        <w:pBdr>
+          <w:bottom w:val="single" w:color="D8DCE2" w:sz="6" w:space="4"/>
+        </w:pBdr>
+        <w:spacing w:after="200" w:before="200"/>
+      </w:pPr>
+      <w:r>
+        <w:t xml:space="preserve"/>
+      </w:r>
+    </w:p>
+    <w:p>
+      <w:pPr>
+        <w:pStyle w:val="Heading1"/>
+        <w:spacing w:after="100" w:before="480"/>
+      </w:pPr>
+      <w:r>
+        <w:rPr>
+          <w:b/>
+          <w:bCs/>
+          <w:color w:val="1A4D8F"/>
+          <w:sz w:val="32"/>
+          <w:szCs w:val="32"/>
+        </w:rPr>
+        <w:t xml:space="preserve">Artifact 4: AI/ML Tool Evaluation Scorecard</w:t>
+      </w:r>
+    </w:p>
+    <w:p>
+      <w:pPr>
+        <w:spacing w:after="180"/>
+      </w:pPr>
+      <w:r>
+        <w:rPr>
+          <w:b/>
+          <w:bCs/>
+        </w:rPr>
+        <w:t xml:space="preserve">What it is: </w:t>
+      </w:r>
+      <w:r>
+        <w:t xml:space="preserve">A self-directed exercise, not a submitted class assignment. A working, weighted scorecard that scores a candidate AI/ML tool across seven criteria and returns a recommendation: Adopt, Pilot First, or Pass.</w:t>
+      </w:r>
+    </w:p>
+    <w:p>
+      <w:pPr>
+        <w:spacing w:after="180"/>
+      </w:pPr>
+      <w:r>
+        <w:rPr>
+          <w:b/>
+          <w:bCs/>
+        </w:rPr>
+        <w:t xml:space="preserve">How it was made: </w:t>
+      </w:r>
+      <w:r>
+        <w:t xml:space="preserve">I built it directly from a gap I named in my own Artifact 1 reflection, where I wrote that the AI/ML Integration Leadership Skills Self-Assessment was missing a category for evaluating tools and vendors. I picked the seven factors I actually weigh when deciding whether to adopt something at work, then weighted problem fit and data readiness highest, since a tool that is wrong for the problem or the data cannot be fixed with better change management afterward.</w:t>
+      </w:r>
+    </w:p>
+    <w:p>
+      <w:pPr>
+        <w:spacing w:after="180"/>
+      </w:pPr>
+      <w:r>
+        <w:rPr>
+          <w:b/>
+          <w:bCs/>
+        </w:rPr>
+        <w:t xml:space="preserve">Why it's here: </w:t>
+      </w:r>
+      <w:r>
+        <w:t xml:space="preserve">This shows I close the gaps I identify in myself instead of just naming them. It also rounds out the portfolio with a hands-on technical piece, distinct from the reflective writing in Artifacts 1 and 3 and the written analysis in Artifact 2.</w:t>
       </w:r>
     </w:p>
     <w:p>
@@ -333,6 +405,19 @@
       </w:pPr>
       <w:r>
         <w:t xml:space="preserve">Adapting to Challenges: Leading Through Uncertainty (full written reflection, .docx)</w:t>
+      </w:r>
+    </w:p>
+    <w:p>
+      <w:pPr>
+        <w:pStyle w:val="ListParagraph"/>
+        <w:numPr>
+          <w:ilvl w:val="0"/>
+          <w:numId w:val="1"/>
+        </w:numPr>
+        <w:spacing w:after="90"/>
+      </w:pPr>
+      <w:r>
+        <w:t xml:space="preserve">AI/ML Tool Evaluation Scorecard (live interactive tool, .html)</w:t>
       </w:r>
     </w:p>
     <w:sectPr>

</xml_diff>

<commit_message>
Swap Artifact 4 for real coursework (Assignment 4.1)
Replaces the self-directed AI/ML Tool Evaluation Scorecard with
Communication in Leadership, an actual AIML-501 devotional
assignment, to satisfy the rubric's requirement that the artifact
be authentic and tied to coursework. Removes the now-unused
scorecard tool and updates the combined overview doc.
</commit_message>
<xml_diff>
--- a/files/Portfolio Overview - Both Artifacts Explained.docx
+++ b/files/Portfolio Overview - Both Artifacts Explained.docx
@@ -37,7 +37,7 @@
         <w:spacing w:after="180"/>
       </w:pPr>
       <w:r>
-        <w:t xml:space="preserve">This document explains all four artifacts in my AIML portfolio side by side: what each one is, how it was made, and why it's included. Full write-ups, completed forms, and the live tools are attached or linked as separate items in the portfolio; this is the short version of all four stories in one place.</w:t>
+        <w:t xml:space="preserve">This document explains all four artifacts in my AIML portfolio side by side: what each one is, how it was made, and why it's included. Full write-ups and completed forms are attached as separate files in the portfolio; this is the short version of all four stories in one place.</w:t>
       </w:r>
     </w:p>
     <w:p>
@@ -280,7 +280,7 @@
           <w:sz w:val="32"/>
           <w:szCs w:val="32"/>
         </w:rPr>
-        <w:t xml:space="preserve">Artifact 4: AI/ML Tool Evaluation Scorecard</w:t>
+        <w:t xml:space="preserve">Artifact 4: Communication in Leadership, A Devotional Reflection</w:t>
       </w:r>
     </w:p>
     <w:p>
@@ -295,7 +295,7 @@
         <w:t xml:space="preserve">What it is: </w:t>
       </w:r>
       <w:r>
-        <w:t xml:space="preserve">A self-directed exercise, not a submitted class assignment. A working, weighted scorecard that scores a candidate AI/ML tool across seven criteria and returns a recommendation: Adopt, Pilot First, or Pass.</w:t>
+        <w:t xml:space="preserve">A written reflection for AIML-501, Assignment 4.1, examining my own communication style as an FP&amp;A analyst through two passages, 1 Corinthians 14:8-9 on the need for a clear signal, and Genesis 11:6-7 on what happens when people stop understanding each other the same way.</w:t>
       </w:r>
     </w:p>
     <w:p>
@@ -310,7 +310,7 @@
         <w:t xml:space="preserve">How it was made: </w:t>
       </w:r>
       <w:r>
-        <w:t xml:space="preserve">I built it directly from a gap I named in my own Artifact 1 reflection, where I wrote that the AI/ML Integration Leadership Skills Self-Assessment was missing a category for evaluating tools and vendors. I picked the seven factors I actually weigh when deciding whether to adopt something at work, then weighted problem fit and data readiness highest, since a tool that is wrong for the problem or the data cannot be fixed with better change management afterward.</w:t>
+        <w:t xml:space="preserve">I named a specific weakness (assuming that because I understand a number, everyone reading the report does too), then tested it against something that actually happened: a weekly sales scorecard I sent without walking the sales team through the logic first, which caused several reps to think their numbers were wrong when nothing was actually wrong with the data.</w:t>
       </w:r>
     </w:p>
     <w:p>
@@ -325,7 +325,7 @@
         <w:t xml:space="preserve">Why it's here: </w:t>
       </w:r>
       <w:r>
-        <w:t xml:space="preserve">This shows I close the gaps I identify in myself instead of just naming them. It also rounds out the portfolio with a hands-on technical piece, distinct from the reflective writing in Artifacts 1 and 3 and the written analysis in Artifact 2.</w:t>
+        <w:t xml:space="preserve">Artifact 1 named stakeholder communication as a strength. This reflection shows where that strength actually came from: a real failure, a specific fix, and a habit I still use, not just a self-reported score. It also pairs with Artifact 3, which was about the courage to raise a hard truth. This is the other half, making sure people understand you once you do.</w:t>
       </w:r>
     </w:p>
     <w:p>
@@ -417,7 +417,7 @@
         <w:spacing w:after="90"/>
       </w:pPr>
       <w:r>
-        <w:t xml:space="preserve">AI/ML Tool Evaluation Scorecard (live interactive tool, .html)</w:t>
+        <w:t xml:space="preserve">Communication in Leadership: A Devotional Reflection (full written reflection, .docx)</w:t>
       </w:r>
     </w:p>
     <w:sectPr>

</xml_diff>